<commit_message>
Update Japanese game brief for Tokiq: refine descriptions, improve clarity, and enhance emotional engagement.
</commit_message>
<xml_diff>
--- a/tokiq/docs/game-brief/Tokiq Game Brief.docx
+++ b/tokiq/docs/game-brief/Tokiq Game Brief.docx
@@ -64,7 +64,7 @@
         <w:pStyle w:val="FirstParagraph"/>
       </w:pPr>
       <w:r>
-        <w:t xml:space="preserve">What Tokiq is, how it is played, why it holds attention, and where it can go. Prepared as a clear introduction to the concept and its current state.</w:t>
+        <w:t xml:space="preserve">An introduction to the concept: what Tokiq is, how it is played, why it holds attention, and how we intend to validate it.</w:t>
       </w:r>
     </w:p>
     <w:p>
@@ -133,13 +133,13 @@
         <w:t xml:space="preserve">Executive Summary</w:t>
       </w:r>
     </w:p>
-    <w:bookmarkStart w:id="22" w:name="the-one-minute-version"/>
+    <w:bookmarkStart w:id="22" w:name="tokiq-in-one-minute"/>
     <w:p>
       <w:pPr>
         <w:pStyle w:val="Heading1"/>
       </w:pPr>
       <w:r>
-        <w:t xml:space="preserve">The one-minute version</w:t>
+        <w:t xml:space="preserve">Tokiq in one minute</w:t>
       </w:r>
     </w:p>
     <w:p>
@@ -179,20 +179,7 @@
         <w:t xml:space="preserve"> </w:t>
       </w:r>
       <w:r>
-        <w:t xml:space="preserve">closest to the target wins a shared prize pool. It is easy to grasp in seconds and built around one universal feeling: the held breath before you act, and the ache of being</w:t>
-      </w:r>
-      <w:r>
-        <w:t xml:space="preserve"> </w:t>
-      </w:r>
-      <w:r>
-        <w:rPr>
-          <w:iCs/>
-          <w:i/>
-        </w:rPr>
-        <w:t xml:space="preserve">so close</w:t>
-      </w:r>
-      <w:r>
-        <w:t xml:space="preserve">.</w:t>
+        <w:t xml:space="preserve">closest to the target wins a shared prize pool. It can be understood in seconds, and it is built around a feeling everyone knows: the tension just before you act, and the frustration of missing by a fraction of a second.</w:t>
       </w:r>
     </w:p>
     <w:p>
@@ -438,7 +425,7 @@
       </w:r>
     </w:p>
     <w:bookmarkEnd w:id="23"/>
-    <w:bookmarkStart w:id="24" w:name="the-concept"/>
+    <w:bookmarkStart w:id="24" w:name="what-tokiq-is"/>
     <w:p>
       <w:pPr>
         <w:pStyle w:val="Heading2"/>
@@ -447,7 +434,7 @@
         <w:t xml:space="preserve">01</w:t>
       </w:r>
       <w:r>
-        <w:t xml:space="preserve">The concept</w:t>
+        <w:t xml:space="preserve">What Tokiq is</w:t>
       </w:r>
     </w:p>
     <w:p>
@@ -534,7 +521,7 @@
         <w:t xml:space="preserve">precision and nerve</w:t>
       </w:r>
       <w:r>
-        <w:t xml:space="preserve">: the held breath before the tap, and the small, addictive ache of a near miss.</w:t>
+        <w:t xml:space="preserve">: the moment of focus before the tap, and the strong pull of a near miss.</w:t>
       </w:r>
     </w:p>
     <w:p>
@@ -565,7 +552,7 @@
         <w:pStyle w:val="BodyText"/>
       </w:pPr>
       <w:r>
-        <w:t xml:space="preserve">This brief is written to be candid rather than promotional. It presents the promise of Tokiq together with the genuine weaknesses and open questions that remain, which are set out in full in Section 08. You are also warmly welcome to try the prototype yourself, whenever it is convenient, at</w:t>
+        <w:t xml:space="preserve">This brief is intended to be candid rather than promotional. It presents the promise of Tokiq alongside the genuine weaknesses and open questions that remain, set out in full in Section 08. We also encourage you to try the prototype yourself, whenever convenient, at</w:t>
       </w:r>
       <w:r>
         <w:t xml:space="preserve"> </w:t>
@@ -579,7 +566,10 @@
         </w:r>
       </w:hyperlink>
       <w:r>
-        <w:t xml:space="preserve">. A few minutes with it will tell you more than any description can.</w:t>
+        <w:t xml:space="preserve"> </w:t>
+      </w:r>
+      <w:r>
+        <w:t xml:space="preserve">— a few minutes with it will convey more than any description.</w:t>
       </w:r>
     </w:p>
     <w:bookmarkEnd w:id="24"/>
@@ -834,7 +824,7 @@
         <w:t xml:space="preserve"> </w:t>
       </w:r>
       <w:r>
-        <w:t xml:space="preserve">pool for the winner. The countdown hits GO and the clock starts climbing.</w:t>
+        <w:t xml:space="preserve">pool for the winner. The countdown hits GO and the clock starts climbing:</w:t>
       </w:r>
       <w:r>
         <w:t xml:space="preserve"> </w:t>
@@ -842,19 +832,13 @@
       <w:r>
         <w:t xml:space="preserve">3 … 6 … 8 …</w:t>
       </w:r>
-      <w:r>
-        <w:t xml:space="preserve"> </w:t>
-      </w:r>
-      <w:r>
-        <w:t xml:space="preserve">The ticks tighten as it nears ten.</w:t>
-      </w:r>
-    </w:p>
-    <w:p>
-      <w:pPr>
-        <w:pStyle w:val="BodyText"/>
-      </w:pPr>
-      <w:r>
-        <w:t xml:space="preserve">You tap. The clock freezes at</w:t>
+    </w:p>
+    <w:p>
+      <w:pPr>
+        <w:pStyle w:val="BodyText"/>
+      </w:pPr>
+      <w:r>
+        <w:t xml:space="preserve">You tap, and the clock freezes at</w:t>
       </w:r>
       <w:r>
         <w:t xml:space="preserve"> </w:t>
@@ -876,15 +860,33 @@
         <w:t xml:space="preserve">0.03</w:t>
       </w:r>
       <w:r>
-        <w:t xml:space="preserve">, and someone else, off by 0.02, takes the pool.</w:t>
-      </w:r>
-    </w:p>
-    <w:p>
-      <w:pPr>
-        <w:pStyle w:val="BodyText"/>
-      </w:pPr>
-      <w:r>
-        <w:t xml:space="preserve">The sting is exact and personal:</w:t>
+        <w:t xml:space="preserve"> </w:t>
+      </w:r>
+      <w:r>
+        <w:t xml:space="preserve">— and someone else, off by 0.02, takes the pool.</w:t>
+      </w:r>
+    </w:p>
+    <w:p>
+      <w:pPr>
+        <w:pStyle w:val="BodyText"/>
+      </w:pPr>
+      <w:r>
+        <w:t xml:space="preserve">A loss that narrow does not feel like a loss; it feels like an invitation to try again. Most players do exactly that.</w:t>
+      </w:r>
+    </w:p>
+    <w:p>
+      <w:pPr>
+        <w:pStyle w:val="BodyText"/>
+      </w:pPr>
+      <w:r>
+        <w:rPr>
+          <w:bCs/>
+          <w:b/>
+        </w:rPr>
+        <w:t xml:space="preserve">Why it matters</w:t>
+      </w:r>
+      <w:r>
+        <w:t xml:space="preserve">The skill is entirely in the tap: no luck in</w:t>
       </w:r>
       <w:r>
         <w:t xml:space="preserve"> </w:t>
@@ -894,37 +896,6 @@
           <w:iCs/>
           <w:i/>
         </w:rPr>
-        <w:t xml:space="preserve">so close.</w:t>
-      </w:r>
-      <w:r>
-        <w:t xml:space="preserve"> </w:t>
-      </w:r>
-      <w:r>
-        <w:t xml:space="preserve">Your thumb is already reaching for “play next round.”</w:t>
-      </w:r>
-    </w:p>
-    <w:p>
-      <w:pPr>
-        <w:pStyle w:val="BodyText"/>
-      </w:pPr>
-      <w:r>
-        <w:rPr>
-          <w:bCs/>
-          <w:b/>
-        </w:rPr>
-        <w:t xml:space="preserve">Why it matters</w:t>
-      </w:r>
-      <w:r>
-        <w:t xml:space="preserve">The skill is entirely in the tap: no luck in</w:t>
-      </w:r>
-      <w:r>
-        <w:t xml:space="preserve"> </w:t>
-      </w:r>
-      <w:r>
-        <w:rPr>
-          <w:iCs/>
-          <w:i/>
-        </w:rPr>
         <w:t xml:space="preserve">when</w:t>
       </w:r>
       <w:r>
@@ -935,7 +906,7 @@
       </w:r>
     </w:p>
     <w:bookmarkEnd w:id="28"/>
-    <w:bookmarkStart w:id="32" w:name="why-it-holds-attention"/>
+    <w:bookmarkStart w:id="32" w:name="why-players-come-back"/>
     <w:p>
       <w:pPr>
         <w:pStyle w:val="Heading2"/>
@@ -944,7 +915,7 @@
         <w:t xml:space="preserve">03</w:t>
       </w:r>
       <w:r>
-        <w:t xml:space="preserve">Why it holds attention</w:t>
+        <w:t xml:space="preserve">Why players come back</w:t>
       </w:r>
     </w:p>
     <w:p>
@@ -965,7 +936,7 @@
         <w:t xml:space="preserve">unpredictable</w:t>
       </w:r>
       <w:r>
-        <w:t xml:space="preserve">, and because each round leaves an emotional residue that asks to be resolved. Several forces work at once:</w:t>
+        <w:t xml:space="preserve">, and because each round ends with an emotional pull toward the next one. Several forces work at once:</w:t>
       </w:r>
     </w:p>
     <w:p>
@@ -1003,20 +974,7 @@
         <w:t xml:space="preserve">The near-miss</w:t>
       </w:r>
       <w:r>
-        <w:t xml:space="preserve">: “off by 0.03 seconds” motivates far more than a clean loss. It whispers</w:t>
-      </w:r>
-      <w:r>
-        <w:t xml:space="preserve"> </w:t>
-      </w:r>
-      <w:r>
-        <w:rPr>
-          <w:iCs/>
-          <w:i/>
-        </w:rPr>
-        <w:t xml:space="preserve">next time</w:t>
-      </w:r>
-      <w:r>
-        <w:t xml:space="preserve">.</w:t>
+        <w:t xml:space="preserve">: “off by 0.03 seconds” motivates far more than a clear loss; it suggests the next attempt will succeed.</w:t>
       </w:r>
     </w:p>
     <w:p>
@@ -1183,7 +1141,7 @@
       </w:r>
     </w:p>
     <w:bookmarkEnd w:id="32"/>
-    <w:bookmarkStart w:id="33" w:name="the-market-and-why-now"/>
+    <w:bookmarkStart w:id="33" w:name="the-market-opportunity"/>
     <w:p>
       <w:pPr>
         <w:pStyle w:val="Heading2"/>
@@ -1192,7 +1150,7 @@
         <w:t xml:space="preserve">04</w:t>
       </w:r>
       <w:r>
-        <w:t xml:space="preserve">The market, and why now</w:t>
+        <w:t xml:space="preserve">The market opportunity</w:t>
       </w:r>
     </w:p>
     <w:p>
@@ -1200,7 +1158,7 @@
         <w:pStyle w:val="FirstParagraph"/>
       </w:pPr>
       <w:r>
-        <w:t xml:space="preserve">Tokiq is not entering an empty space. It draws on the behavioural design of the “crash game” category, whose defining product, Aviator by Spribe, operates at a scale very few digital products reach. The figures below indicate the size of the appetite this format has already proven.</w:t>
+        <w:t xml:space="preserve">Tokiq is not entering an empty space. It draws on the behavioural design of the “crash game” category, whose defining product, Aviator by Spribe, operates at a scale very few digital products reach. The figures below indicate the scale of demand this format has already proven.</w:t>
       </w:r>
     </w:p>
     <w:p>
@@ -1325,7 +1283,7 @@
       </w:r>
     </w:p>
     <w:bookmarkEnd w:id="33"/>
-    <w:bookmarkStart w:id="34" w:name="how-tokiq-is-different"/>
+    <w:bookmarkStart w:id="34" w:name="how-tokiq-stands-apart"/>
     <w:p>
       <w:pPr>
         <w:pStyle w:val="Heading2"/>
@@ -1334,7 +1292,7 @@
         <w:t xml:space="preserve">05</w:t>
       </w:r>
       <w:r>
-        <w:t xml:space="preserve">How Tokiq is different</w:t>
+        <w:t xml:space="preserve">How Tokiq stands apart</w:t>
       </w:r>
     </w:p>
     <w:p>
@@ -1601,7 +1559,7 @@
       </w:r>
     </w:p>
     <w:bookmarkEnd w:id="34"/>
-    <w:bookmarkStart w:id="35" w:name="the-economics"/>
+    <w:bookmarkStart w:id="35" w:name="the-business-model"/>
     <w:p>
       <w:pPr>
         <w:pStyle w:val="Heading2"/>
@@ -1610,7 +1568,7 @@
         <w:t xml:space="preserve">06</w:t>
       </w:r>
       <w:r>
-        <w:t xml:space="preserve">The economics</w:t>
+        <w:t xml:space="preserve">The business model</w:t>
       </w:r>
     </w:p>
     <w:p>
@@ -1709,7 +1667,7 @@
       </w:r>
     </w:p>
     <w:bookmarkEnd w:id="35"/>
-    <w:bookmarkStart w:id="36" w:name="what-we-have-built-today"/>
+    <w:bookmarkStart w:id="36" w:name="the-prototype-today"/>
     <w:p>
       <w:pPr>
         <w:pStyle w:val="Heading2"/>
@@ -1718,7 +1676,7 @@
         <w:t xml:space="preserve">07</w:t>
       </w:r>
       <w:r>
-        <w:t xml:space="preserve">What we have built today</w:t>
+        <w:t xml:space="preserve">The prototype today</w:t>
       </w:r>
     </w:p>
     <w:p>
@@ -1726,20 +1684,20 @@
         <w:pStyle w:val="FirstParagraph"/>
       </w:pPr>
       <w:r>
-        <w:t xml:space="preserve">We have a</w:t>
-      </w:r>
-      <w:r>
-        <w:t xml:space="preserve"> </w:t>
-      </w:r>
-      <w:r>
-        <w:rPr>
-          <w:bCs/>
-          <w:b/>
-        </w:rPr>
-        <w:t xml:space="preserve">convincing, front-end-only prototype</w:t>
-      </w:r>
-      <w:r>
-        <w:t xml:space="preserve">, designed to look and feel like a live multiplayer product for demonstrations and concept validation. It runs in any browser, installs as an app (PWA), and speaks</w:t>
+        <w:t xml:space="preserve">Tokiq exists today as a</w:t>
+      </w:r>
+      <w:r>
+        <w:t xml:space="preserve"> </w:t>
+      </w:r>
+      <w:r>
+        <w:rPr>
+          <w:bCs/>
+          <w:b/>
+        </w:rPr>
+        <w:t xml:space="preserve">front-end-only prototype</w:t>
+      </w:r>
+      <w:r>
+        <w:t xml:space="preserve">, built for demonstrations and concept validation and designed to look and feel like a live multiplayer product. It runs in any browser, installs as an app (PWA), and supports</w:t>
       </w:r>
       <w:r>
         <w:t xml:space="preserve"> </w:t>
@@ -1776,7 +1734,7 @@
         <w:pStyle w:val="BodyText"/>
       </w:pPr>
       <w:r>
-        <w:t xml:space="preserve">We are deliberately honest about what is real and what is theatre, because that distinction shapes the entire plan:</w:t>
+        <w:t xml:space="preserve">We are explicit about what is real and what is simulated, because that distinction shapes the entire plan:</w:t>
       </w:r>
     </w:p>
     <w:tbl>
@@ -1936,11 +1894,11 @@
         <w:t xml:space="preserve">The honest core</w:t>
       </w:r>
       <w:r>
-        <w:t xml:space="preserve">The one genuinely interactive element, the timer and your tap, is exactly the part that needs proving. It is enough to make a person feel the “I was so close” hook, which is the entire point of the prototype.</w:t>
+        <w:t xml:space="preserve">The one genuinely interactive element — the timer and your tap — is exactly the part that needs proving. It is enough to let a person feel the “so close” hook, and that is the entire purpose of the prototype.</w:t>
       </w:r>
     </w:p>
     <w:bookmarkEnd w:id="36"/>
-    <w:bookmarkStart w:id="43" w:name="an-honest-assessment"/>
+    <w:bookmarkStart w:id="44" w:name="risks-and-open-questions"/>
     <w:p>
       <w:pPr>
         <w:pStyle w:val="Heading2"/>
@@ -1949,7 +1907,7 @@
         <w:t xml:space="preserve">08</w:t>
       </w:r>
       <w:r>
-        <w:t xml:space="preserve">An honest assessment</w:t>
+        <w:t xml:space="preserve">Risks and open questions</w:t>
       </w:r>
     </w:p>
     <w:p>
@@ -1991,13 +1949,13 @@
       </w:r>
     </w:p>
     <w:bookmarkEnd w:id="37"/>
-    <w:bookmarkStart w:id="38" w:name="Xabe9b8972ffe9cfe6c156de3574a5e6bbd54154"/>
+    <w:bookmarkStart w:id="38" w:name="the-fairness-model-is-not-yet-real."/>
     <w:p>
       <w:pPr>
         <w:pStyle w:val="Heading3"/>
       </w:pPr>
       <w:r>
-        <w:t xml:space="preserve">The fairness model is not yet real, and the algorithm has limits.</w:t>
+        <w:t xml:space="preserve">The fairness model is not yet real.</w:t>
       </w:r>
     </w:p>
     <w:p>
@@ -2018,7 +1976,25 @@
         <w:t xml:space="preserve">exploitable in a real product</w:t>
       </w:r>
       <w:r>
-        <w:t xml:space="preserve">: a determined player could manipulate their own timing, and players on slower connections would be at a genuine disadvantage. Truly fair play needs server-controlled timing, latency compensation, and a verifiable provably-fair guarantee. None of these exists yet, and together they form the core engineering challenge. The opponents in the prototype are also</w:t>
+        <w:t xml:space="preserve">: a determined player could manipulate their own timing, and players on slower connections would be at a genuine disadvantage. Truly fair play needs server-controlled timing, latency compensation, and a verifiable provably-fair guarantee. None of these exists yet, and together they form the core engineering challenge.</w:t>
+      </w:r>
+    </w:p>
+    <w:bookmarkEnd w:id="38"/>
+    <w:bookmarkStart w:id="39" w:name="the-prototype-flatters-the-experience."/>
+    <w:p>
+      <w:pPr>
+        <w:pStyle w:val="Heading3"/>
+      </w:pPr>
+      <w:r>
+        <w:t xml:space="preserve">The prototype flatters the experience.</w:t>
+      </w:r>
+    </w:p>
+    <w:p>
+      <w:pPr>
+        <w:pStyle w:val="FirstParagraph"/>
+      </w:pPr>
+      <w:r>
+        <w:t xml:space="preserve">The opponents in the prototype are</w:t>
       </w:r>
       <w:r>
         <w:t xml:space="preserve"> </w:t>
@@ -2034,8 +2010,8 @@
         <w:t xml:space="preserve">: their times are generated with gentle statistical noise clustered around the target so that they read as skilful. Real players will show far more variance, and a round may feel quite different as a result. We also keep each table small on purpose (8–14 players) so that a person can plausibly win during a demonstration; with hundreds of real players, winning becomes much harder, which would change the experience in ways we have not yet tested.</w:t>
       </w:r>
     </w:p>
-    <w:bookmarkEnd w:id="38"/>
-    <w:bookmarkStart w:id="39" w:name="X5ba1066e164eb5af69793def437b555cb3b7e80"/>
+    <w:bookmarkEnd w:id="39"/>
+    <w:bookmarkStart w:id="40" w:name="X5ba1066e164eb5af69793def437b555cb3b7e80"/>
     <w:p>
       <w:pPr>
         <w:pStyle w:val="Heading3"/>
@@ -2052,8 +2028,8 @@
         <w:t xml:space="preserve">Retention is the make-or-break question, and because the multiplayer is simulated, the prototype cannot answer it. The near-miss may prove a strong enough hook to bring a player back after repeated losses, or it may not. Willingness to pay is equally untested: the ¥100 entry and 10% house fee are placeholders, with no real price discovery yet.</w:t>
       </w:r>
     </w:p>
-    <w:bookmarkEnd w:id="39"/>
-    <w:bookmarkStart w:id="40" w:name="Xc7ad9278459bd833c15f9c987e74d3547a2eaa0"/>
+    <w:bookmarkEnd w:id="40"/>
+    <w:bookmarkStart w:id="41" w:name="Xc7ad9278459bd833c15f9c987e74d3547a2eaa0"/>
     <w:p>
       <w:pPr>
         <w:pStyle w:val="Heading3"/>
@@ -2070,8 +2046,8 @@
         <w:t xml:space="preserve">Our case rests on a stronger sense of skill and a cleaner, more social feel. Both are reasonable, and both are unproven. Under real conditions, with human reaction variance and network latency, Tokiq could feel less skill-driven than intended, and closer to the luck-led experience it hopes to improve upon.</w:t>
       </w:r>
     </w:p>
-    <w:bookmarkEnd w:id="40"/>
-    <w:bookmarkStart w:id="41" w:name="X486b3cc7e868362e36940af5b4e6a5c04938626"/>
+    <w:bookmarkEnd w:id="41"/>
+    <w:bookmarkStart w:id="42" w:name="X486b3cc7e868362e36940af5b4e6a5c04938626"/>
     <w:p>
       <w:pPr>
         <w:pStyle w:val="Heading3"/>
@@ -2088,8 +2064,8 @@
         <w:t xml:space="preserve">Pay-to-enter with a prize pool calls for careful legal review, and the skill-based framing helps the gambling question without guaranteeing exemption. This review could reshape, delay, or stop the model, so we treat it as a first-order risk rather than a footnote, to be examined early and in parallel with everything else.</w:t>
       </w:r>
     </w:p>
-    <w:bookmarkEnd w:id="41"/>
-    <w:bookmarkStart w:id="42" w:name="the-economics-are-not-yet-modelled."/>
+    <w:bookmarkEnd w:id="42"/>
+    <w:bookmarkStart w:id="43" w:name="the-economics-are-not-yet-modelled."/>
     <w:p>
       <w:pPr>
         <w:pStyle w:val="Heading3"/>
@@ -2434,9 +2410,9 @@
         <w:t xml:space="preserve">None of these is a reason to stop. They are the reason to proceed carefully, and in the order set out next.</w:t>
       </w:r>
     </w:p>
-    <w:bookmarkEnd w:id="42"/>
     <w:bookmarkEnd w:id="43"/>
-    <w:bookmarkStart w:id="44" w:name="the-plan-ahead"/>
+    <w:bookmarkEnd w:id="44"/>
+    <w:bookmarkStart w:id="45" w:name="the-validation-plan"/>
     <w:p>
       <w:pPr>
         <w:pStyle w:val="Heading2"/>
@@ -2445,7 +2421,7 @@
         <w:t xml:space="preserve">09</w:t>
       </w:r>
       <w:r>
-        <w:t xml:space="preserve">The plan ahead</w:t>
+        <w:t xml:space="preserve">The validation plan</w:t>
       </w:r>
     </w:p>
     <w:p>
@@ -2453,7 +2429,7 @@
         <w:pStyle w:val="FirstParagraph"/>
       </w:pPr>
       <w:r>
-        <w:t xml:space="preserve">The plan exists to answer the questions above in the cheapest and safest order. Our guiding rule is simple:</w:t>
+        <w:t xml:space="preserve">The plan exists to answer the questions in Section 08, in the cheapest and safest order. Our guiding rule is simple:</w:t>
       </w:r>
       <w:r>
         <w:t xml:space="preserve"> </w:t>
@@ -2469,7 +2445,7 @@
         <w:t xml:space="preserve"> </w:t>
       </w:r>
       <w:r>
-        <w:t xml:space="preserve">We run the cheapest experiments first and spend on hard engineering only once the signals justify it. The path is a series of decision gates:</w:t>
+        <w:t xml:space="preserve">The path is a series of decision gates, each of which must be passed before the next investment is made:</w:t>
       </w:r>
     </w:p>
     <w:p>
@@ -2549,7 +2525,7 @@
         <w:pStyle w:val="BodyText"/>
       </w:pPr>
       <w:r>
-        <w:t xml:space="preserve">Beyond the gates, the genuinely hard parts are known, and intentionally placed last:</w:t>
+        <w:t xml:space="preserve">Beyond the gates lie the four hard builds identified in Section 08, deliberately scheduled last:</w:t>
       </w:r>
     </w:p>
     <w:p>
@@ -2656,14 +2632,14 @@
         <w:t xml:space="preserve">Cheap experiments first; the costly build follows the evidence. We spend serious money only after real players show they return and bring friends.</w:t>
       </w:r>
     </w:p>
-    <w:bookmarkEnd w:id="44"/>
-    <w:bookmarkStart w:id="45" w:name="in-closing"/>
+    <w:bookmarkEnd w:id="45"/>
+    <w:bookmarkStart w:id="46" w:name="conclusion"/>
     <w:p>
       <w:pPr>
         <w:pStyle w:val="Heading2"/>
       </w:pPr>
       <w:r>
-        <w:t xml:space="preserve">In closing</w:t>
+        <w:t xml:space="preserve">Conclusion</w:t>
       </w:r>
     </w:p>
     <w:p>
@@ -2671,7 +2647,7 @@
         <w:pStyle w:val="FirstParagraph"/>
       </w:pPr>
       <w:r>
-        <w:t xml:space="preserve">Tokiq takes a single, universal moment: the held breath before you act, and the ache of being</w:t>
+        <w:t xml:space="preserve">Tokiq takes a single, universal moment — the instant before you act, and the feeling of being</w:t>
       </w:r>
       <w:r>
         <w:t xml:space="preserve"> </w:t>
@@ -2684,7 +2660,10 @@
         <w:t xml:space="preserve">so close</w:t>
       </w:r>
       <w:r>
-        <w:t xml:space="preserve">. It turns that into a fast, social, skill-based loop. The category it draws on has already proven a very large appetite; the opportunity is to offer that appetite a cleaner, more skilful, and more shareable form.</w:t>
+        <w:t xml:space="preserve"> </w:t>
+      </w:r>
+      <w:r>
+        <w:t xml:space="preserve">— and turns it into a fast, social, skill-based game. The category it draws on has already proven very large demand; the opportunity is to serve that demand in a cleaner, more skilful, and more shareable form.</w:t>
       </w:r>
     </w:p>
     <w:p>
@@ -2700,7 +2679,7 @@
         <w:pStyle w:val="BodyText"/>
       </w:pPr>
       <w:r>
-        <w:t xml:space="preserve">You are warmly welcome to try the prototype at your convenience, at</w:t>
+        <w:t xml:space="preserve">We invite you to try the prototype at your convenience, at</w:t>
       </w:r>
       <w:r>
         <w:t xml:space="preserve"> </w:t>
@@ -2714,10 +2693,10 @@
         </w:r>
       </w:hyperlink>
       <w:r>
-        <w:t xml:space="preserve">. We would be glad to walk you through it and the thinking behind it, and we would genuinely value your perspective, including any doubts or concerns you may have. Thank you for taking the time to consider it.</w:t>
-      </w:r>
-    </w:p>
-    <w:bookmarkEnd w:id="45"/>
+        <w:t xml:space="preserve">. We would be glad to walk you through it and the thinking behind it, and we would genuinely value your perspective — including any doubts or concerns. Thank you for taking the time to consider it.</w:t>
+      </w:r>
+    </w:p>
+    <w:bookmarkEnd w:id="46"/>
     <w:sectPr/>
   </w:body>
 </w:document>

</xml_diff>